<commit_message>
📖 docs: Atualização nos modelos de reuniões
Algumas mudanças nos modelos de reuniões:
-Troca de "Participantes" para "Faltas": para facilitar na hora de escrever menos nomes
- Adição de colunas "Descrição" e "Comentários" nas tabelas de tarefas, para ajudar no entendimento das mesmas
</commit_message>
<xml_diff>
--- a/documentos/padrões_de_qualidade/Modelo de Ata de Sprint Planning.docx
+++ b/documentos/padrões_de_qualidade/Modelo de Ata de Sprint Planning.docx
@@ -320,17 +320,7 @@
           <w:szCs w:val="28"/>
           <w:rtl w:val="0"/>
         </w:rPr>
-        <w:t xml:space="preserve">MODELO DE ATA DE </w:t>
-      </w:r>
-      <w:r>
-        <w:rPr>
-          <w:rFonts w:ascii="Arial Narrow" w:cs="Arial Narrow" w:eastAsia="Arial Narrow" w:hAnsi="Arial Narrow"/>
-          <w:b w:val="1"/>
-          <w:sz w:val="28"/>
-          <w:szCs w:val="28"/>
-          <w:rtl w:val="0"/>
-        </w:rPr>
-        <w:t xml:space="preserve">REUNIÃO</w:t>
+        <w:t xml:space="preserve">MODELO DE ATA DE REUNIÃO</w:t>
       </w:r>
       <w:r>
         <w:rPr>
@@ -343,11 +333,6 @@
         </w:rPr>
         <w:t xml:space="preserve">1</w:t>
       </w:r>
-      <w:r>
-        <w:rPr>
-          <w:rtl w:val="0"/>
-        </w:rPr>
-      </w:r>
     </w:p>
     <w:p>
       <w:pPr>
@@ -576,7 +561,7 @@
         <w:rPr>
           <w:rtl w:val="0"/>
         </w:rPr>
-        <w:t xml:space="preserve">Sexta-feira, dia 4 de setembro de 2025</w:t>
+        <w:t xml:space="preserve">Terça-feira, dia 4 de setembro de 2025</w:t>
       </w:r>
       <w:r>
         <w:rPr>
@@ -602,13 +587,13 @@
         <w:pStyle w:val="Heading2"/>
         <w:rPr/>
       </w:pPr>
-      <w:bookmarkStart w:colFirst="0" w:colLast="0" w:name="_zxp56tuenis" w:id="0"/>
+      <w:bookmarkStart w:colFirst="0" w:colLast="0" w:name="_89hrtl2tuijv" w:id="0"/>
       <w:bookmarkEnd w:id="0"/>
       <w:r>
         <w:rPr>
           <w:rtl w:val="0"/>
         </w:rPr>
-        <w:t xml:space="preserve">Participantes</w:t>
+        <w:t xml:space="preserve">Faltas</w:t>
       </w:r>
     </w:p>
     <w:p>
@@ -660,7 +645,7 @@
         <w:pStyle w:val="Heading2"/>
         <w:rPr/>
       </w:pPr>
-      <w:bookmarkStart w:colFirst="0" w:colLast="0" w:name="_swpzod4xiq7b" w:id="1"/>
+      <w:bookmarkStart w:colFirst="0" w:colLast="0" w:name="_refhab382clz" w:id="1"/>
       <w:bookmarkEnd w:id="1"/>
       <w:r>
         <w:rPr>
@@ -686,9 +671,7 @@
           <w:numId w:val="1"/>
         </w:numPr>
         <w:ind w:left="720" w:hanging="360"/>
-        <w:rPr>
-          <w:u w:val="none"/>
-        </w:rPr>
+        <w:rPr/>
       </w:pPr>
       <w:r>
         <w:rPr>
@@ -701,7 +684,7 @@
         <w:pStyle w:val="Heading2"/>
         <w:rPr/>
       </w:pPr>
-      <w:bookmarkStart w:colFirst="0" w:colLast="0" w:name="_v2oo6f4y3m5t" w:id="2"/>
+      <w:bookmarkStart w:colFirst="0" w:colLast="0" w:name="_fzatg14i1enr" w:id="2"/>
       <w:bookmarkEnd w:id="2"/>
       <w:r>
         <w:rPr>
@@ -723,7 +706,7 @@
     <w:tbl>
       <w:tblPr>
         <w:tblStyle w:val="Table1"/>
-        <w:tblW w:w="9029.0" w:type="dxa"/>
+        <w:tblW w:w="9000.0" w:type="dxa"/>
         <w:jc w:val="left"/>
         <w:tblBorders>
           <w:top w:color="000000" w:space="0" w:sz="8" w:val="single"/>
@@ -737,14 +720,16 @@
         <w:tblLook w:val="0600"/>
       </w:tblPr>
       <w:tblGrid>
-        <w:gridCol w:w="3009.6666666666665"/>
-        <w:gridCol w:w="3009.6666666666665"/>
-        <w:gridCol w:w="3009.6666666666665"/>
+        <w:gridCol w:w="1905"/>
+        <w:gridCol w:w="1995"/>
+        <w:gridCol w:w="2850"/>
+        <w:gridCol w:w="2250"/>
         <w:tblGridChange w:id="0">
           <w:tblGrid>
-            <w:gridCol w:w="3009.6666666666665"/>
-            <w:gridCol w:w="3009.6666666666665"/>
-            <w:gridCol w:w="3009.6666666666665"/>
+            <w:gridCol w:w="1905"/>
+            <w:gridCol w:w="1995"/>
+            <w:gridCol w:w="2850"/>
+            <w:gridCol w:w="2250"/>
           </w:tblGrid>
         </w:tblGridChange>
       </w:tblGrid>
@@ -768,7 +753,6 @@
             <w:pPr>
               <w:keepNext w:val="0"/>
               <w:keepLines w:val="0"/>
-              <w:pageBreakBefore w:val="0"/>
               <w:widowControl w:val="0"/>
               <w:pBdr>
                 <w:top w:space="0" w:sz="0" w:val="nil"/>
@@ -806,7 +790,6 @@
             <w:pPr>
               <w:keepNext w:val="0"/>
               <w:keepLines w:val="0"/>
-              <w:pageBreakBefore w:val="0"/>
               <w:widowControl w:val="0"/>
               <w:pBdr>
                 <w:top w:space="0" w:sz="0" w:val="nil"/>
@@ -844,7 +827,43 @@
             <w:pPr>
               <w:keepNext w:val="0"/>
               <w:keepLines w:val="0"/>
-              <w:pageBreakBefore w:val="0"/>
+              <w:widowControl w:val="0"/>
+              <w:pBdr>
+                <w:top w:space="0" w:sz="0" w:val="nil"/>
+                <w:left w:space="0" w:sz="0" w:val="nil"/>
+                <w:bottom w:space="0" w:sz="0" w:val="nil"/>
+                <w:right w:space="0" w:sz="0" w:val="nil"/>
+                <w:between w:space="0" w:sz="0" w:val="nil"/>
+              </w:pBdr>
+              <w:shd w:fill="auto" w:val="clear"/>
+              <w:spacing w:after="0" w:before="0" w:line="240" w:lineRule="auto"/>
+              <w:ind w:left="0" w:right="0" w:firstLine="0"/>
+              <w:jc w:val="center"/>
+              <w:rPr/>
+            </w:pPr>
+            <w:r>
+              <w:rPr>
+                <w:rtl w:val="0"/>
+              </w:rPr>
+              <w:t xml:space="preserve">Descrição</w:t>
+            </w:r>
+          </w:p>
+        </w:tc>
+        <w:tc>
+          <w:tcPr>
+            <w:shd w:fill="auto" w:val="clear"/>
+            <w:tcMar>
+              <w:top w:w="100.0" w:type="dxa"/>
+              <w:left w:w="100.0" w:type="dxa"/>
+              <w:bottom w:w="100.0" w:type="dxa"/>
+              <w:right w:w="100.0" w:type="dxa"/>
+            </w:tcMar>
+            <w:vAlign w:val="top"/>
+          </w:tcPr>
+          <w:p>
+            <w:pPr>
+              <w:keepNext w:val="0"/>
+              <w:keepLines w:val="0"/>
               <w:widowControl w:val="0"/>
               <w:pBdr>
                 <w:top w:space="0" w:sz="0" w:val="nil"/>
@@ -888,7 +907,6 @@
             <w:pPr>
               <w:keepNext w:val="0"/>
               <w:keepLines w:val="0"/>
-              <w:pageBreakBefore w:val="0"/>
               <w:widowControl w:val="0"/>
               <w:pBdr>
                 <w:top w:space="0" w:sz="0" w:val="nil"/>
@@ -925,7 +943,6 @@
             <w:pPr>
               <w:keepNext w:val="0"/>
               <w:keepLines w:val="0"/>
-              <w:pageBreakBefore w:val="0"/>
               <w:widowControl w:val="0"/>
               <w:pBdr>
                 <w:top w:space="0" w:sz="0" w:val="nil"/>
@@ -962,7 +979,42 @@
             <w:pPr>
               <w:keepNext w:val="0"/>
               <w:keepLines w:val="0"/>
-              <w:pageBreakBefore w:val="0"/>
+              <w:widowControl w:val="0"/>
+              <w:pBdr>
+                <w:top w:space="0" w:sz="0" w:val="nil"/>
+                <w:left w:space="0" w:sz="0" w:val="nil"/>
+                <w:bottom w:space="0" w:sz="0" w:val="nil"/>
+                <w:right w:space="0" w:sz="0" w:val="nil"/>
+                <w:between w:space="0" w:sz="0" w:val="nil"/>
+              </w:pBdr>
+              <w:shd w:fill="auto" w:val="clear"/>
+              <w:spacing w:after="0" w:before="0" w:line="240" w:lineRule="auto"/>
+              <w:ind w:left="0" w:right="0" w:firstLine="0"/>
+              <w:jc w:val="left"/>
+              <w:rPr/>
+            </w:pPr>
+            <w:r>
+              <w:rPr>
+                <w:rtl w:val="0"/>
+              </w:rPr>
+            </w:r>
+          </w:p>
+        </w:tc>
+        <w:tc>
+          <w:tcPr>
+            <w:shd w:fill="auto" w:val="clear"/>
+            <w:tcMar>
+              <w:top w:w="100.0" w:type="dxa"/>
+              <w:left w:w="100.0" w:type="dxa"/>
+              <w:bottom w:w="100.0" w:type="dxa"/>
+              <w:right w:w="100.0" w:type="dxa"/>
+            </w:tcMar>
+            <w:vAlign w:val="top"/>
+          </w:tcPr>
+          <w:p>
+            <w:pPr>
+              <w:keepNext w:val="0"/>
+              <w:keepLines w:val="0"/>
               <w:widowControl w:val="0"/>
               <w:pBdr>
                 <w:top w:space="0" w:sz="0" w:val="nil"/>
@@ -1005,7 +1057,6 @@
             <w:pPr>
               <w:keepNext w:val="0"/>
               <w:keepLines w:val="0"/>
-              <w:pageBreakBefore w:val="0"/>
               <w:widowControl w:val="0"/>
               <w:pBdr>
                 <w:top w:space="0" w:sz="0" w:val="nil"/>
@@ -1042,7 +1093,6 @@
             <w:pPr>
               <w:keepNext w:val="0"/>
               <w:keepLines w:val="0"/>
-              <w:pageBreakBefore w:val="0"/>
               <w:widowControl w:val="0"/>
               <w:pBdr>
                 <w:top w:space="0" w:sz="0" w:val="nil"/>
@@ -1079,7 +1129,42 @@
             <w:pPr>
               <w:keepNext w:val="0"/>
               <w:keepLines w:val="0"/>
-              <w:pageBreakBefore w:val="0"/>
+              <w:widowControl w:val="0"/>
+              <w:pBdr>
+                <w:top w:space="0" w:sz="0" w:val="nil"/>
+                <w:left w:space="0" w:sz="0" w:val="nil"/>
+                <w:bottom w:space="0" w:sz="0" w:val="nil"/>
+                <w:right w:space="0" w:sz="0" w:val="nil"/>
+                <w:between w:space="0" w:sz="0" w:val="nil"/>
+              </w:pBdr>
+              <w:shd w:fill="auto" w:val="clear"/>
+              <w:spacing w:after="0" w:before="0" w:line="240" w:lineRule="auto"/>
+              <w:ind w:left="0" w:right="0" w:firstLine="0"/>
+              <w:jc w:val="left"/>
+              <w:rPr/>
+            </w:pPr>
+            <w:r>
+              <w:rPr>
+                <w:rtl w:val="0"/>
+              </w:rPr>
+            </w:r>
+          </w:p>
+        </w:tc>
+        <w:tc>
+          <w:tcPr>
+            <w:shd w:fill="auto" w:val="clear"/>
+            <w:tcMar>
+              <w:top w:w="100.0" w:type="dxa"/>
+              <w:left w:w="100.0" w:type="dxa"/>
+              <w:bottom w:w="100.0" w:type="dxa"/>
+              <w:right w:w="100.0" w:type="dxa"/>
+            </w:tcMar>
+            <w:vAlign w:val="top"/>
+          </w:tcPr>
+          <w:p>
+            <w:pPr>
+              <w:keepNext w:val="0"/>
+              <w:keepLines w:val="0"/>
               <w:widowControl w:val="0"/>
               <w:pBdr>
                 <w:top w:space="0" w:sz="0" w:val="nil"/>
@@ -1122,7 +1207,6 @@
             <w:pPr>
               <w:keepNext w:val="0"/>
               <w:keepLines w:val="0"/>
-              <w:pageBreakBefore w:val="0"/>
               <w:widowControl w:val="0"/>
               <w:pBdr>
                 <w:top w:space="0" w:sz="0" w:val="nil"/>
@@ -1159,7 +1243,6 @@
             <w:pPr>
               <w:keepNext w:val="0"/>
               <w:keepLines w:val="0"/>
-              <w:pageBreakBefore w:val="0"/>
               <w:widowControl w:val="0"/>
               <w:pBdr>
                 <w:top w:space="0" w:sz="0" w:val="nil"/>
@@ -1196,7 +1279,42 @@
             <w:pPr>
               <w:keepNext w:val="0"/>
               <w:keepLines w:val="0"/>
-              <w:pageBreakBefore w:val="0"/>
+              <w:widowControl w:val="0"/>
+              <w:pBdr>
+                <w:top w:space="0" w:sz="0" w:val="nil"/>
+                <w:left w:space="0" w:sz="0" w:val="nil"/>
+                <w:bottom w:space="0" w:sz="0" w:val="nil"/>
+                <w:right w:space="0" w:sz="0" w:val="nil"/>
+                <w:between w:space="0" w:sz="0" w:val="nil"/>
+              </w:pBdr>
+              <w:shd w:fill="auto" w:val="clear"/>
+              <w:spacing w:after="0" w:before="0" w:line="240" w:lineRule="auto"/>
+              <w:ind w:left="0" w:right="0" w:firstLine="0"/>
+              <w:jc w:val="left"/>
+              <w:rPr/>
+            </w:pPr>
+            <w:r>
+              <w:rPr>
+                <w:rtl w:val="0"/>
+              </w:rPr>
+            </w:r>
+          </w:p>
+        </w:tc>
+        <w:tc>
+          <w:tcPr>
+            <w:shd w:fill="auto" w:val="clear"/>
+            <w:tcMar>
+              <w:top w:w="100.0" w:type="dxa"/>
+              <w:left w:w="100.0" w:type="dxa"/>
+              <w:bottom w:w="100.0" w:type="dxa"/>
+              <w:right w:w="100.0" w:type="dxa"/>
+            </w:tcMar>
+            <w:vAlign w:val="top"/>
+          </w:tcPr>
+          <w:p>
+            <w:pPr>
+              <w:keepNext w:val="0"/>
+              <w:keepLines w:val="0"/>
               <w:widowControl w:val="0"/>
               <w:pBdr>
                 <w:top w:space="0" w:sz="0" w:val="nil"/>
@@ -1239,7 +1357,6 @@
             <w:pPr>
               <w:keepNext w:val="0"/>
               <w:keepLines w:val="0"/>
-              <w:pageBreakBefore w:val="0"/>
               <w:widowControl w:val="0"/>
               <w:pBdr>
                 <w:top w:space="0" w:sz="0" w:val="nil"/>
@@ -1276,7 +1393,6 @@
             <w:pPr>
               <w:keepNext w:val="0"/>
               <w:keepLines w:val="0"/>
-              <w:pageBreakBefore w:val="0"/>
               <w:widowControl w:val="0"/>
               <w:pBdr>
                 <w:top w:space="0" w:sz="0" w:val="nil"/>
@@ -1313,7 +1429,42 @@
             <w:pPr>
               <w:keepNext w:val="0"/>
               <w:keepLines w:val="0"/>
-              <w:pageBreakBefore w:val="0"/>
+              <w:widowControl w:val="0"/>
+              <w:pBdr>
+                <w:top w:space="0" w:sz="0" w:val="nil"/>
+                <w:left w:space="0" w:sz="0" w:val="nil"/>
+                <w:bottom w:space="0" w:sz="0" w:val="nil"/>
+                <w:right w:space="0" w:sz="0" w:val="nil"/>
+                <w:between w:space="0" w:sz="0" w:val="nil"/>
+              </w:pBdr>
+              <w:shd w:fill="auto" w:val="clear"/>
+              <w:spacing w:after="0" w:before="0" w:line="240" w:lineRule="auto"/>
+              <w:ind w:left="0" w:right="0" w:firstLine="0"/>
+              <w:jc w:val="left"/>
+              <w:rPr/>
+            </w:pPr>
+            <w:r>
+              <w:rPr>
+                <w:rtl w:val="0"/>
+              </w:rPr>
+            </w:r>
+          </w:p>
+        </w:tc>
+        <w:tc>
+          <w:tcPr>
+            <w:shd w:fill="auto" w:val="clear"/>
+            <w:tcMar>
+              <w:top w:w="100.0" w:type="dxa"/>
+              <w:left w:w="100.0" w:type="dxa"/>
+              <w:bottom w:w="100.0" w:type="dxa"/>
+              <w:right w:w="100.0" w:type="dxa"/>
+            </w:tcMar>
+            <w:vAlign w:val="top"/>
+          </w:tcPr>
+          <w:p>
+            <w:pPr>
+              <w:keepNext w:val="0"/>
+              <w:keepLines w:val="0"/>
               <w:widowControl w:val="0"/>
               <w:pBdr>
                 <w:top w:space="0" w:sz="0" w:val="nil"/>
@@ -1356,7 +1507,6 @@
             <w:pPr>
               <w:keepNext w:val="0"/>
               <w:keepLines w:val="0"/>
-              <w:pageBreakBefore w:val="0"/>
               <w:widowControl w:val="0"/>
               <w:pBdr>
                 <w:top w:space="0" w:sz="0" w:val="nil"/>
@@ -1393,7 +1543,6 @@
             <w:pPr>
               <w:keepNext w:val="0"/>
               <w:keepLines w:val="0"/>
-              <w:pageBreakBefore w:val="0"/>
               <w:widowControl w:val="0"/>
               <w:pBdr>
                 <w:top w:space="0" w:sz="0" w:val="nil"/>
@@ -1430,7 +1579,42 @@
             <w:pPr>
               <w:keepNext w:val="0"/>
               <w:keepLines w:val="0"/>
-              <w:pageBreakBefore w:val="0"/>
+              <w:widowControl w:val="0"/>
+              <w:pBdr>
+                <w:top w:space="0" w:sz="0" w:val="nil"/>
+                <w:left w:space="0" w:sz="0" w:val="nil"/>
+                <w:bottom w:space="0" w:sz="0" w:val="nil"/>
+                <w:right w:space="0" w:sz="0" w:val="nil"/>
+                <w:between w:space="0" w:sz="0" w:val="nil"/>
+              </w:pBdr>
+              <w:shd w:fill="auto" w:val="clear"/>
+              <w:spacing w:after="0" w:before="0" w:line="240" w:lineRule="auto"/>
+              <w:ind w:left="0" w:right="0" w:firstLine="0"/>
+              <w:jc w:val="left"/>
+              <w:rPr/>
+            </w:pPr>
+            <w:r>
+              <w:rPr>
+                <w:rtl w:val="0"/>
+              </w:rPr>
+            </w:r>
+          </w:p>
+        </w:tc>
+        <w:tc>
+          <w:tcPr>
+            <w:shd w:fill="auto" w:val="clear"/>
+            <w:tcMar>
+              <w:top w:w="100.0" w:type="dxa"/>
+              <w:left w:w="100.0" w:type="dxa"/>
+              <w:bottom w:w="100.0" w:type="dxa"/>
+              <w:right w:w="100.0" w:type="dxa"/>
+            </w:tcMar>
+            <w:vAlign w:val="top"/>
+          </w:tcPr>
+          <w:p>
+            <w:pPr>
+              <w:keepNext w:val="0"/>
+              <w:keepLines w:val="0"/>
               <w:widowControl w:val="0"/>
               <w:pBdr>
                 <w:top w:space="0" w:sz="0" w:val="nil"/>
@@ -1473,7 +1657,6 @@
             <w:pPr>
               <w:keepNext w:val="0"/>
               <w:keepLines w:val="0"/>
-              <w:pageBreakBefore w:val="0"/>
               <w:widowControl w:val="0"/>
               <w:pBdr>
                 <w:top w:space="0" w:sz="0" w:val="nil"/>
@@ -1510,7 +1693,6 @@
             <w:pPr>
               <w:keepNext w:val="0"/>
               <w:keepLines w:val="0"/>
-              <w:pageBreakBefore w:val="0"/>
               <w:widowControl w:val="0"/>
               <w:pBdr>
                 <w:top w:space="0" w:sz="0" w:val="nil"/>
@@ -1547,7 +1729,42 @@
             <w:pPr>
               <w:keepNext w:val="0"/>
               <w:keepLines w:val="0"/>
-              <w:pageBreakBefore w:val="0"/>
+              <w:widowControl w:val="0"/>
+              <w:pBdr>
+                <w:top w:space="0" w:sz="0" w:val="nil"/>
+                <w:left w:space="0" w:sz="0" w:val="nil"/>
+                <w:bottom w:space="0" w:sz="0" w:val="nil"/>
+                <w:right w:space="0" w:sz="0" w:val="nil"/>
+                <w:between w:space="0" w:sz="0" w:val="nil"/>
+              </w:pBdr>
+              <w:shd w:fill="auto" w:val="clear"/>
+              <w:spacing w:after="0" w:before="0" w:line="240" w:lineRule="auto"/>
+              <w:ind w:left="0" w:right="0" w:firstLine="0"/>
+              <w:jc w:val="left"/>
+              <w:rPr/>
+            </w:pPr>
+            <w:r>
+              <w:rPr>
+                <w:rtl w:val="0"/>
+              </w:rPr>
+            </w:r>
+          </w:p>
+        </w:tc>
+        <w:tc>
+          <w:tcPr>
+            <w:shd w:fill="auto" w:val="clear"/>
+            <w:tcMar>
+              <w:top w:w="100.0" w:type="dxa"/>
+              <w:left w:w="100.0" w:type="dxa"/>
+              <w:bottom w:w="100.0" w:type="dxa"/>
+              <w:right w:w="100.0" w:type="dxa"/>
+            </w:tcMar>
+            <w:vAlign w:val="top"/>
+          </w:tcPr>
+          <w:p>
+            <w:pPr>
+              <w:keepNext w:val="0"/>
+              <w:keepLines w:val="0"/>
               <w:widowControl w:val="0"/>
               <w:pBdr>
                 <w:top w:space="0" w:sz="0" w:val="nil"/>
@@ -1586,13 +1803,13 @@
         <w:pStyle w:val="Heading2"/>
         <w:rPr/>
       </w:pPr>
-      <w:bookmarkStart w:colFirst="0" w:colLast="0" w:name="_d1tifqxke351" w:id="3"/>
+      <w:bookmarkStart w:colFirst="0" w:colLast="0" w:name="_ktvymq6fn5hx" w:id="3"/>
       <w:bookmarkEnd w:id="3"/>
       <w:r>
         <w:rPr>
           <w:rtl w:val="0"/>
         </w:rPr>
-        <w:t xml:space="preserve">Tópicos Secundários</w:t>
+        <w:t xml:space="preserve">Tópicos Secundários (Outros assuntos)</w:t>
       </w:r>
     </w:p>
     <w:p>
@@ -1612,9 +1829,7 @@
           <w:numId w:val="2"/>
         </w:numPr>
         <w:ind w:left="720" w:hanging="360"/>
-        <w:rPr>
-          <w:u w:val="none"/>
-        </w:rPr>
+        <w:rPr/>
       </w:pPr>
       <w:r>
         <w:rPr>
@@ -1637,18 +1852,13 @@
         <w:pStyle w:val="Heading2"/>
         <w:rPr/>
       </w:pPr>
-      <w:bookmarkStart w:colFirst="0" w:colLast="0" w:name="_wuz43gdvbuzh" w:id="4"/>
+      <w:bookmarkStart w:colFirst="0" w:colLast="0" w:name="_kisewpid12wx" w:id="4"/>
       <w:bookmarkEnd w:id="4"/>
       <w:r>
         <w:rPr>
           <w:rtl w:val="0"/>
         </w:rPr>
-        <w:t xml:space="preserve">Tópicos futuros</w:t>
-      </w:r>
-      <w:r>
-        <w:rPr>
-          <w:rtl w:val="0"/>
-        </w:rPr>
+        <w:t xml:space="preserve">Tópicos futuros (possíveis adiantamentos)</w:t>
       </w:r>
     </w:p>
     <w:p>
@@ -1664,7 +1874,7 @@
     <w:tbl>
       <w:tblPr>
         <w:tblStyle w:val="Table2"/>
-        <w:tblW w:w="9029.0" w:type="dxa"/>
+        <w:tblW w:w="9000.0" w:type="dxa"/>
         <w:jc w:val="left"/>
         <w:tblBorders>
           <w:top w:color="000000" w:space="0" w:sz="8" w:val="single"/>
@@ -1678,14 +1888,16 @@
         <w:tblLook w:val="0600"/>
       </w:tblPr>
       <w:tblGrid>
-        <w:gridCol w:w="3009.6666666666665"/>
-        <w:gridCol w:w="3009.6666666666665"/>
-        <w:gridCol w:w="3009.6666666666665"/>
+        <w:gridCol w:w="1965"/>
+        <w:gridCol w:w="1995"/>
+        <w:gridCol w:w="2790"/>
+        <w:gridCol w:w="2250"/>
         <w:tblGridChange w:id="0">
           <w:tblGrid>
-            <w:gridCol w:w="3009.6666666666665"/>
-            <w:gridCol w:w="3009.6666666666665"/>
-            <w:gridCol w:w="3009.6666666666665"/>
+            <w:gridCol w:w="1965"/>
+            <w:gridCol w:w="1995"/>
+            <w:gridCol w:w="2790"/>
+            <w:gridCol w:w="2250"/>
           </w:tblGrid>
         </w:tblGridChange>
       </w:tblGrid>
@@ -1709,7 +1921,6 @@
             <w:pPr>
               <w:keepNext w:val="0"/>
               <w:keepLines w:val="0"/>
-              <w:pageBreakBefore w:val="0"/>
               <w:widowControl w:val="0"/>
               <w:pBdr>
                 <w:top w:space="0" w:sz="0" w:val="nil"/>
@@ -1747,7 +1958,6 @@
             <w:pPr>
               <w:keepNext w:val="0"/>
               <w:keepLines w:val="0"/>
-              <w:pageBreakBefore w:val="0"/>
               <w:widowControl w:val="0"/>
               <w:pBdr>
                 <w:top w:space="0" w:sz="0" w:val="nil"/>
@@ -1785,7 +1995,43 @@
             <w:pPr>
               <w:keepNext w:val="0"/>
               <w:keepLines w:val="0"/>
-              <w:pageBreakBefore w:val="0"/>
+              <w:widowControl w:val="0"/>
+              <w:pBdr>
+                <w:top w:space="0" w:sz="0" w:val="nil"/>
+                <w:left w:space="0" w:sz="0" w:val="nil"/>
+                <w:bottom w:space="0" w:sz="0" w:val="nil"/>
+                <w:right w:space="0" w:sz="0" w:val="nil"/>
+                <w:between w:space="0" w:sz="0" w:val="nil"/>
+              </w:pBdr>
+              <w:shd w:fill="auto" w:val="clear"/>
+              <w:spacing w:after="0" w:before="0" w:line="240" w:lineRule="auto"/>
+              <w:ind w:left="0" w:right="0" w:firstLine="0"/>
+              <w:jc w:val="center"/>
+              <w:rPr/>
+            </w:pPr>
+            <w:r>
+              <w:rPr>
+                <w:rtl w:val="0"/>
+              </w:rPr>
+              <w:t xml:space="preserve">Descrição</w:t>
+            </w:r>
+          </w:p>
+        </w:tc>
+        <w:tc>
+          <w:tcPr>
+            <w:shd w:fill="auto" w:val="clear"/>
+            <w:tcMar>
+              <w:top w:w="100.0" w:type="dxa"/>
+              <w:left w:w="100.0" w:type="dxa"/>
+              <w:bottom w:w="100.0" w:type="dxa"/>
+              <w:right w:w="100.0" w:type="dxa"/>
+            </w:tcMar>
+            <w:vAlign w:val="top"/>
+          </w:tcPr>
+          <w:p>
+            <w:pPr>
+              <w:keepNext w:val="0"/>
+              <w:keepLines w:val="0"/>
               <w:widowControl w:val="0"/>
               <w:pBdr>
                 <w:top w:space="0" w:sz="0" w:val="nil"/>
@@ -1836,7 +2082,6 @@
             <w:pPr>
               <w:keepNext w:val="0"/>
               <w:keepLines w:val="0"/>
-              <w:pageBreakBefore w:val="0"/>
               <w:widowControl w:val="0"/>
               <w:pBdr>
                 <w:top w:space="0" w:sz="0" w:val="nil"/>
@@ -1873,7 +2118,6 @@
             <w:pPr>
               <w:keepNext w:val="0"/>
               <w:keepLines w:val="0"/>
-              <w:pageBreakBefore w:val="0"/>
               <w:widowControl w:val="0"/>
               <w:pBdr>
                 <w:top w:space="0" w:sz="0" w:val="nil"/>
@@ -1910,7 +2154,42 @@
             <w:pPr>
               <w:keepNext w:val="0"/>
               <w:keepLines w:val="0"/>
-              <w:pageBreakBefore w:val="0"/>
+              <w:widowControl w:val="0"/>
+              <w:pBdr>
+                <w:top w:space="0" w:sz="0" w:val="nil"/>
+                <w:left w:space="0" w:sz="0" w:val="nil"/>
+                <w:bottom w:space="0" w:sz="0" w:val="nil"/>
+                <w:right w:space="0" w:sz="0" w:val="nil"/>
+                <w:between w:space="0" w:sz="0" w:val="nil"/>
+              </w:pBdr>
+              <w:shd w:fill="auto" w:val="clear"/>
+              <w:spacing w:after="0" w:before="0" w:line="240" w:lineRule="auto"/>
+              <w:ind w:left="0" w:right="0" w:firstLine="0"/>
+              <w:jc w:val="left"/>
+              <w:rPr/>
+            </w:pPr>
+            <w:r>
+              <w:rPr>
+                <w:rtl w:val="0"/>
+              </w:rPr>
+            </w:r>
+          </w:p>
+        </w:tc>
+        <w:tc>
+          <w:tcPr>
+            <w:shd w:fill="auto" w:val="clear"/>
+            <w:tcMar>
+              <w:top w:w="100.0" w:type="dxa"/>
+              <w:left w:w="100.0" w:type="dxa"/>
+              <w:bottom w:w="100.0" w:type="dxa"/>
+              <w:right w:w="100.0" w:type="dxa"/>
+            </w:tcMar>
+            <w:vAlign w:val="top"/>
+          </w:tcPr>
+          <w:p>
+            <w:pPr>
+              <w:keepNext w:val="0"/>
+              <w:keepLines w:val="0"/>
               <w:widowControl w:val="0"/>
               <w:pBdr>
                 <w:top w:space="0" w:sz="0" w:val="nil"/>
@@ -1953,7 +2232,6 @@
             <w:pPr>
               <w:keepNext w:val="0"/>
               <w:keepLines w:val="0"/>
-              <w:pageBreakBefore w:val="0"/>
               <w:widowControl w:val="0"/>
               <w:pBdr>
                 <w:top w:space="0" w:sz="0" w:val="nil"/>
@@ -1990,7 +2268,6 @@
             <w:pPr>
               <w:keepNext w:val="0"/>
               <w:keepLines w:val="0"/>
-              <w:pageBreakBefore w:val="0"/>
               <w:widowControl w:val="0"/>
               <w:pBdr>
                 <w:top w:space="0" w:sz="0" w:val="nil"/>
@@ -2027,7 +2304,42 @@
             <w:pPr>
               <w:keepNext w:val="0"/>
               <w:keepLines w:val="0"/>
-              <w:pageBreakBefore w:val="0"/>
+              <w:widowControl w:val="0"/>
+              <w:pBdr>
+                <w:top w:space="0" w:sz="0" w:val="nil"/>
+                <w:left w:space="0" w:sz="0" w:val="nil"/>
+                <w:bottom w:space="0" w:sz="0" w:val="nil"/>
+                <w:right w:space="0" w:sz="0" w:val="nil"/>
+                <w:between w:space="0" w:sz="0" w:val="nil"/>
+              </w:pBdr>
+              <w:shd w:fill="auto" w:val="clear"/>
+              <w:spacing w:after="0" w:before="0" w:line="240" w:lineRule="auto"/>
+              <w:ind w:left="0" w:right="0" w:firstLine="0"/>
+              <w:jc w:val="left"/>
+              <w:rPr/>
+            </w:pPr>
+            <w:r>
+              <w:rPr>
+                <w:rtl w:val="0"/>
+              </w:rPr>
+            </w:r>
+          </w:p>
+        </w:tc>
+        <w:tc>
+          <w:tcPr>
+            <w:shd w:fill="auto" w:val="clear"/>
+            <w:tcMar>
+              <w:top w:w="100.0" w:type="dxa"/>
+              <w:left w:w="100.0" w:type="dxa"/>
+              <w:bottom w:w="100.0" w:type="dxa"/>
+              <w:right w:w="100.0" w:type="dxa"/>
+            </w:tcMar>
+            <w:vAlign w:val="top"/>
+          </w:tcPr>
+          <w:p>
+            <w:pPr>
+              <w:keepNext w:val="0"/>
+              <w:keepLines w:val="0"/>
               <w:widowControl w:val="0"/>
               <w:pBdr>
                 <w:top w:space="0" w:sz="0" w:val="nil"/>
@@ -2056,7 +2368,7 @@
         <w:pStyle w:val="Heading2"/>
         <w:rPr/>
       </w:pPr>
-      <w:bookmarkStart w:colFirst="0" w:colLast="0" w:name="_rbgea7bkfth4" w:id="5"/>
+      <w:bookmarkStart w:colFirst="0" w:colLast="0" w:name="_q2nuulu3w6jb" w:id="5"/>
       <w:bookmarkEnd w:id="5"/>
       <w:r>
         <w:rPr>

</xml_diff>